<commit_message>
Lighting Campground and basement
</commit_message>
<xml_diff>
--- a/Dokumentasi/Dokumen Lighting.docx
+++ b/Dokumentasi/Dokumen Lighting.docx
@@ -100,7 +100,7 @@
           <w:szCs w:val="24"/>
           <w:lang w:val="en-US" w:eastAsia="zh-CN"/>
         </w:rPr>
-        <w:t>Malam tidak terlalu gelap, masih ada pencahayaan dari bulan dan terdapat sedikit kabut.</w:t>
+        <w:t>Malam tidak terlalu gelap, masih ada pencahayaan dari bulan dan terdapat kabut.Ada beberapa penempatan pencahayaan pada tempat yang bisa dikunjungi player.</w:t>
       </w:r>
       <w:r>
         <w:rPr>
@@ -202,7 +202,7 @@
           <w:rFonts w:hint="eastAsia"/>
           <w:lang w:val="en-US" w:eastAsia="zh-CN"/>
         </w:rPr>
-        <w:t>Lighting akan cukup terang untuk memulai game dengan atmosfir yang tidak terlalu horror.</w:t>
+        <w:t>Lighting akan cukup terang untuk memulai game dengan atmosfir yang tidak terlalu horror. Terdapat event pertama yang akan terjadi pada tempat ini, yaitu lampu akan berkedip saat pintu Storage Room pertama kali terbuka.</w:t>
       </w:r>
       <w:r>
         <w:rPr>
@@ -293,7 +293,7 @@
           <w:rFonts w:hint="eastAsia"/>
           <w:lang w:val="en-US" w:eastAsia="zh-CN"/>
         </w:rPr>
-        <w:t>Gelap tapi masih bisa melihat sekitar. Atmosfir akan dibuat lebih horror.</w:t>
+        <w:t>Gelap tapi masih bisa melihat sekitar.</w:t>
       </w:r>
       <w:r>
         <w:rPr>
@@ -335,9 +335,9 @@
         </w:rPr>
         <w:drawing>
           <wp:inline distT="0" distB="0" distL="114300" distR="114300">
-            <wp:extent cx="5562600" cy="4171950"/>
-            <wp:effectExtent l="0" t="0" r="0" b="6350"/>
-            <wp:docPr id="4" name="图片 4" descr="IMG_256"/>
+            <wp:extent cx="4263390" cy="2387600"/>
+            <wp:effectExtent l="0" t="0" r="3810" b="0"/>
+            <wp:docPr id="6" name="图片 1" descr="IMG_256"/>
             <wp:cNvGraphicFramePr>
               <a:graphicFrameLocks xmlns:a="http://schemas.openxmlformats.org/drawingml/2006/main" noChangeAspect="1"/>
             </wp:cNvGraphicFramePr>
@@ -345,7 +345,7 @@
               <a:graphicData uri="http://schemas.openxmlformats.org/drawingml/2006/picture">
                 <pic:pic xmlns:pic="http://schemas.openxmlformats.org/drawingml/2006/picture">
                   <pic:nvPicPr>
-                    <pic:cNvPr id="4" name="图片 4" descr="IMG_256"/>
+                    <pic:cNvPr id="6" name="图片 1" descr="IMG_256"/>
                     <pic:cNvPicPr>
                       <a:picLocks noChangeAspect="1"/>
                     </pic:cNvPicPr>
@@ -359,7 +359,7 @@
                   <pic:spPr>
                     <a:xfrm>
                       <a:off x="0" y="0"/>
-                      <a:ext cx="5562600" cy="4171950"/>
+                      <a:ext cx="4263390" cy="2387600"/>
                     </a:xfrm>
                     <a:prstGeom prst="rect">
                       <a:avLst/>
@@ -388,7 +388,28 @@
           <w:rFonts w:hint="eastAsia"/>
           <w:lang w:val="en-US" w:eastAsia="zh-CN"/>
         </w:rPr>
-        <w:t>1-2 lampu point light berwarna merah.</w:t>
+        <w:t>Akan berwarna lebih abu-abu. Memiliki pencahayaan yang paling redup dari ruang lainnya dan akan menggunakan post process volume untuk menambahkan efek blur.</w:t>
+      </w:r>
+    </w:p>
+    <w:p>
+      <w:pPr>
+        <w:rPr>
+          <w:rFonts w:hint="eastAsia" w:ascii="宋体" w:hAnsi="宋体" w:eastAsia="宋体" w:cs="宋体"/>
+          <w:kern w:val="0"/>
+          <w:sz w:val="24"/>
+          <w:szCs w:val="24"/>
+          <w:lang w:val="en-US" w:eastAsia="zh-CN" w:bidi="ar"/>
+        </w:rPr>
+      </w:pPr>
+      <w:r>
+        <w:rPr>
+          <w:rFonts w:hint="eastAsia" w:ascii="宋体" w:hAnsi="宋体" w:eastAsia="宋体" w:cs="宋体"/>
+          <w:kern w:val="0"/>
+          <w:sz w:val="24"/>
+          <w:szCs w:val="24"/>
+          <w:lang w:val="en-US" w:eastAsia="zh-CN" w:bidi="ar"/>
+        </w:rPr>
+        <w:br w:type="page"/>
       </w:r>
     </w:p>
     <w:p>
@@ -399,7 +420,7 @@
         <w:suppressLineNumbers w:val="0"/>
         <w:jc w:val="left"/>
         <w:rPr>
-          <w:rFonts w:hint="default" w:ascii="宋体" w:hAnsi="宋体" w:eastAsia="宋体" w:cs="宋体"/>
+          <w:rFonts w:hint="eastAsia" w:ascii="宋体" w:hAnsi="宋体" w:eastAsia="宋体" w:cs="宋体"/>
           <w:kern w:val="0"/>
           <w:sz w:val="24"/>
           <w:szCs w:val="24"/>
@@ -435,8 +456,8 @@
         </w:rPr>
         <w:drawing>
           <wp:inline distT="0" distB="0" distL="114300" distR="114300">
-            <wp:extent cx="5485130" cy="3082290"/>
-            <wp:effectExtent l="0" t="0" r="1270" b="3810"/>
+            <wp:extent cx="5098415" cy="2865120"/>
+            <wp:effectExtent l="0" t="0" r="6985" b="5080"/>
             <wp:docPr id="5" name="图片 5" descr="IMG_256"/>
             <wp:cNvGraphicFramePr>
               <a:graphicFrameLocks xmlns:a="http://schemas.openxmlformats.org/drawingml/2006/main" noChangeAspect="1"/>
@@ -459,7 +480,7 @@
                   <pic:spPr>
                     <a:xfrm>
                       <a:off x="0" y="0"/>
-                      <a:ext cx="5485130" cy="3082290"/>
+                      <a:ext cx="5098415" cy="2865120"/>
                     </a:xfrm>
                     <a:prstGeom prst="rect">
                       <a:avLst/>
@@ -501,67 +522,274 @@
     </w:p>
     <w:p>
       <w:pPr>
+        <w:keepNext w:val="0"/>
+        <w:keepLines w:val="0"/>
+        <w:widowControl/>
+        <w:suppressLineNumbers w:val="0"/>
+        <w:jc w:val="left"/>
+      </w:pPr>
+      <w:r>
+        <w:rPr>
+          <w:rFonts w:hint="eastAsia"/>
+          <w:lang w:val="en-US" w:eastAsia="zh-CN"/>
+        </w:rPr>
+        <w:t>Torture room menggunakan spotlight merah pada setiap tempat penyiksaan. Juga akan diberi rect light berwarna merah untuk pencahayaan secara keseluruhan.</w:t>
+      </w:r>
+      <w:r>
+        <w:rPr>
+          <w:rFonts w:hint="eastAsia"/>
+          <w:lang w:val="en-US" w:eastAsia="zh-CN"/>
+        </w:rPr>
+        <w:br w:type="textWrapping"/>
+      </w:r>
+      <w:r>
+        <w:rPr>
+          <w:rFonts w:ascii="宋体" w:hAnsi="宋体" w:eastAsia="宋体" w:cs="宋体"/>
+          <w:kern w:val="0"/>
+          <w:sz w:val="24"/>
+          <w:szCs w:val="24"/>
+          <w:lang w:val="en-US" w:eastAsia="zh-CN" w:bidi="ar"/>
+        </w:rPr>
+        <w:drawing>
+          <wp:inline distT="0" distB="0" distL="114300" distR="114300">
+            <wp:extent cx="4413250" cy="2482215"/>
+            <wp:effectExtent l="0" t="0" r="6350" b="6985"/>
+            <wp:docPr id="9" name="图片 2" descr="IMG_256"/>
+            <wp:cNvGraphicFramePr>
+              <a:graphicFrameLocks xmlns:a="http://schemas.openxmlformats.org/drawingml/2006/main" noChangeAspect="1"/>
+            </wp:cNvGraphicFramePr>
+            <a:graphic xmlns:a="http://schemas.openxmlformats.org/drawingml/2006/main">
+              <a:graphicData uri="http://schemas.openxmlformats.org/drawingml/2006/picture">
+                <pic:pic xmlns:pic="http://schemas.openxmlformats.org/drawingml/2006/picture">
+                  <pic:nvPicPr>
+                    <pic:cNvPr id="9" name="图片 2" descr="IMG_256"/>
+                    <pic:cNvPicPr>
+                      <a:picLocks noChangeAspect="1"/>
+                    </pic:cNvPicPr>
+                  </pic:nvPicPr>
+                  <pic:blipFill>
+                    <a:blip r:embed="rId9"/>
+                    <a:stretch>
+                      <a:fillRect/>
+                    </a:stretch>
+                  </pic:blipFill>
+                  <pic:spPr>
+                    <a:xfrm>
+                      <a:off x="0" y="0"/>
+                      <a:ext cx="4413250" cy="2482215"/>
+                    </a:xfrm>
+                    <a:prstGeom prst="rect">
+                      <a:avLst/>
+                    </a:prstGeom>
+                    <a:noFill/>
+                    <a:ln w="9525">
+                      <a:noFill/>
+                    </a:ln>
+                  </pic:spPr>
+                </pic:pic>
+              </a:graphicData>
+            </a:graphic>
+          </wp:inline>
+        </w:drawing>
+      </w:r>
+    </w:p>
+    <w:p>
+      <w:pPr>
+        <w:keepNext w:val="0"/>
+        <w:keepLines w:val="0"/>
+        <w:widowControl/>
+        <w:suppressLineNumbers w:val="0"/>
+        <w:jc w:val="left"/>
+        <w:rPr>
+          <w:rFonts w:hint="eastAsia"/>
+          <w:lang w:val="en-US" w:eastAsia="zh-CN"/>
+        </w:rPr>
+      </w:pPr>
+      <w:r>
+        <w:rPr>
+          <w:rFonts w:hint="eastAsia"/>
+          <w:lang w:val="en-US" w:eastAsia="zh-CN"/>
+        </w:rPr>
+        <w:br w:type="textWrapping"/>
+      </w:r>
+    </w:p>
+    <w:p>
+      <w:pPr>
+        <w:rPr>
+          <w:rFonts w:hint="eastAsia"/>
+          <w:lang w:val="en-US" w:eastAsia="zh-CN"/>
+        </w:rPr>
+      </w:pPr>
+      <w:r>
+        <w:rPr>
+          <w:rFonts w:hint="eastAsia"/>
+          <w:lang w:val="en-US" w:eastAsia="zh-CN"/>
+        </w:rPr>
+        <w:br w:type="page"/>
+      </w:r>
+    </w:p>
+    <w:p>
+      <w:pPr>
+        <w:keepNext w:val="0"/>
+        <w:keepLines w:val="0"/>
+        <w:widowControl/>
+        <w:suppressLineNumbers w:val="0"/>
+        <w:jc w:val="left"/>
+      </w:pPr>
+      <w:r>
+        <w:rPr>
+          <w:rFonts w:hint="eastAsia"/>
+          <w:lang w:val="en-US" w:eastAsia="zh-CN"/>
+        </w:rPr>
+        <w:t xml:space="preserve">Butcher room menggunakan satu spotlight yang menyorot pada meja pemotongan tubuh dan rect light untuk overall lighting. </w:t>
+      </w:r>
+      <w:bookmarkStart w:id="0" w:name="_GoBack"/>
+      <w:bookmarkEnd w:id="0"/>
+      <w:r>
+        <w:rPr>
+          <w:rFonts w:hint="eastAsia"/>
+          <w:lang w:val="en-US" w:eastAsia="zh-CN"/>
+        </w:rPr>
+        <w:br w:type="textWrapping"/>
+      </w:r>
+      <w:r>
+        <w:rPr>
+          <w:rFonts w:ascii="宋体" w:hAnsi="宋体" w:eastAsia="宋体" w:cs="宋体"/>
+          <w:kern w:val="0"/>
+          <w:sz w:val="24"/>
+          <w:szCs w:val="24"/>
+          <w:lang w:val="en-US" w:eastAsia="zh-CN" w:bidi="ar"/>
+        </w:rPr>
+        <w:drawing>
+          <wp:inline distT="0" distB="0" distL="114300" distR="114300">
+            <wp:extent cx="5000625" cy="3333750"/>
+            <wp:effectExtent l="0" t="0" r="3175" b="6350"/>
+            <wp:docPr id="11" name="图片 4" descr="IMG_256"/>
+            <wp:cNvGraphicFramePr>
+              <a:graphicFrameLocks xmlns:a="http://schemas.openxmlformats.org/drawingml/2006/main" noChangeAspect="1"/>
+            </wp:cNvGraphicFramePr>
+            <a:graphic xmlns:a="http://schemas.openxmlformats.org/drawingml/2006/main">
+              <a:graphicData uri="http://schemas.openxmlformats.org/drawingml/2006/picture">
+                <pic:pic xmlns:pic="http://schemas.openxmlformats.org/drawingml/2006/picture">
+                  <pic:nvPicPr>
+                    <pic:cNvPr id="11" name="图片 4" descr="IMG_256"/>
+                    <pic:cNvPicPr>
+                      <a:picLocks noChangeAspect="1"/>
+                    </pic:cNvPicPr>
+                  </pic:nvPicPr>
+                  <pic:blipFill>
+                    <a:blip r:embed="rId10"/>
+                    <a:stretch>
+                      <a:fillRect/>
+                    </a:stretch>
+                  </pic:blipFill>
+                  <pic:spPr>
+                    <a:xfrm>
+                      <a:off x="0" y="0"/>
+                      <a:ext cx="5000625" cy="3333750"/>
+                    </a:xfrm>
+                    <a:prstGeom prst="rect">
+                      <a:avLst/>
+                    </a:prstGeom>
+                    <a:noFill/>
+                    <a:ln w="9525">
+                      <a:noFill/>
+                    </a:ln>
+                  </pic:spPr>
+                </pic:pic>
+              </a:graphicData>
+            </a:graphic>
+          </wp:inline>
+        </w:drawing>
+      </w:r>
+    </w:p>
+    <w:p>
+      <w:pPr>
+        <w:keepNext w:val="0"/>
+        <w:keepLines w:val="0"/>
+        <w:widowControl/>
+        <w:suppressLineNumbers w:val="0"/>
+        <w:jc w:val="left"/>
+      </w:pPr>
+      <w:r>
+        <w:rPr>
+          <w:rFonts w:hint="eastAsia"/>
+          <w:lang w:val="en-US" w:eastAsia="zh-CN"/>
+        </w:rPr>
+        <w:br w:type="textWrapping"/>
+      </w:r>
+      <w:r>
+        <w:rPr>
+          <w:rFonts w:hint="eastAsia"/>
+          <w:lang w:val="en-US" w:eastAsia="zh-CN"/>
+        </w:rPr>
+        <w:t>Prison cell hanya akan menggunakan rect light yang sangat redup untuk memberi kesan kegelapan.</w:t>
+      </w:r>
+      <w:r>
+        <w:rPr>
+          <w:rFonts w:hint="eastAsia"/>
+          <w:lang w:val="en-US" w:eastAsia="zh-CN"/>
+        </w:rPr>
+        <w:br w:type="textWrapping"/>
+      </w:r>
+      <w:r>
+        <w:rPr>
+          <w:rFonts w:ascii="宋体" w:hAnsi="宋体" w:eastAsia="宋体" w:cs="宋体"/>
+          <w:kern w:val="0"/>
+          <w:sz w:val="24"/>
+          <w:szCs w:val="24"/>
+          <w:lang w:val="en-US" w:eastAsia="zh-CN" w:bidi="ar"/>
+        </w:rPr>
+        <w:drawing>
+          <wp:inline distT="0" distB="0" distL="114300" distR="114300">
+            <wp:extent cx="4723765" cy="2645410"/>
+            <wp:effectExtent l="0" t="0" r="635" b="8890"/>
+            <wp:docPr id="10" name="图片 3" descr="IMG_256"/>
+            <wp:cNvGraphicFramePr>
+              <a:graphicFrameLocks xmlns:a="http://schemas.openxmlformats.org/drawingml/2006/main" noChangeAspect="1"/>
+            </wp:cNvGraphicFramePr>
+            <a:graphic xmlns:a="http://schemas.openxmlformats.org/drawingml/2006/main">
+              <a:graphicData uri="http://schemas.openxmlformats.org/drawingml/2006/picture">
+                <pic:pic xmlns:pic="http://schemas.openxmlformats.org/drawingml/2006/picture">
+                  <pic:nvPicPr>
+                    <pic:cNvPr id="10" name="图片 3" descr="IMG_256"/>
+                    <pic:cNvPicPr>
+                      <a:picLocks noChangeAspect="1"/>
+                    </pic:cNvPicPr>
+                  </pic:nvPicPr>
+                  <pic:blipFill>
+                    <a:blip r:embed="rId11"/>
+                    <a:stretch>
+                      <a:fillRect/>
+                    </a:stretch>
+                  </pic:blipFill>
+                  <pic:spPr>
+                    <a:xfrm>
+                      <a:off x="0" y="0"/>
+                      <a:ext cx="4723765" cy="2645410"/>
+                    </a:xfrm>
+                    <a:prstGeom prst="rect">
+                      <a:avLst/>
+                    </a:prstGeom>
+                    <a:noFill/>
+                    <a:ln w="9525">
+                      <a:noFill/>
+                    </a:ln>
+                  </pic:spPr>
+                </pic:pic>
+              </a:graphicData>
+            </a:graphic>
+          </wp:inline>
+        </w:drawing>
+      </w:r>
+    </w:p>
+    <w:p>
+      <w:pPr>
         <w:rPr>
           <w:rFonts w:hint="default"/>
           <w:lang w:val="en-US" w:eastAsia="zh-CN"/>
         </w:rPr>
       </w:pPr>
-      <w:r>
-        <w:rPr>
-          <w:rFonts w:hint="eastAsia"/>
-          <w:lang w:val="en-US" w:eastAsia="zh-CN"/>
-        </w:rPr>
-        <w:t>Torture room menggunakan spotlight merah pada setiap tempat penyiksaan.</w:t>
-      </w:r>
-      <w:r>
-        <w:rPr>
-          <w:rFonts w:hint="eastAsia"/>
-          <w:lang w:val="en-US" w:eastAsia="zh-CN"/>
-        </w:rPr>
-        <w:br w:type="textWrapping"/>
-      </w:r>
-      <w:r>
-        <w:rPr>
-          <w:rFonts w:hint="eastAsia"/>
-          <w:lang w:val="en-US" w:eastAsia="zh-CN"/>
-        </w:rPr>
-        <w:br w:type="textWrapping"/>
-      </w:r>
-      <w:r>
-        <w:rPr>
-          <w:rFonts w:hint="eastAsia"/>
-          <w:lang w:val="en-US" w:eastAsia="zh-CN"/>
-        </w:rPr>
-        <w:t>Butcher room menggunakan satu spotlight yang menyorot pada meja pemotongan tubuh.</w:t>
-      </w:r>
-      <w:r>
-        <w:rPr>
-          <w:rFonts w:hint="eastAsia"/>
-          <w:lang w:val="en-US" w:eastAsia="zh-CN"/>
-        </w:rPr>
-        <w:br w:type="textWrapping"/>
-      </w:r>
-      <w:r>
-        <w:rPr>
-          <w:rFonts w:hint="eastAsia"/>
-          <w:lang w:val="en-US" w:eastAsia="zh-CN"/>
-        </w:rPr>
-        <w:br w:type="textWrapping"/>
-      </w:r>
-      <w:r>
-        <w:rPr>
-          <w:rFonts w:hint="eastAsia"/>
-          <w:lang w:val="en-US" w:eastAsia="zh-CN"/>
-        </w:rPr>
-        <w:t>Prison cell tidak akan menggunakan lampu untuk membiarkan orang yang tertangkap berada dalam kegelapan.</w:t>
-      </w:r>
-      <w:r>
-        <w:rPr>
-          <w:rFonts w:hint="eastAsia"/>
-          <w:lang w:val="en-US" w:eastAsia="zh-CN"/>
-        </w:rPr>
-        <w:br w:type="textWrapping"/>
-      </w:r>
       <w:r>
         <w:rPr>
           <w:rFonts w:hint="eastAsia"/>
@@ -606,7 +834,7 @@
                     </pic:cNvPicPr>
                   </pic:nvPicPr>
                   <pic:blipFill>
-                    <a:blip r:embed="rId9"/>
+                    <a:blip r:embed="rId12"/>
                     <a:stretch>
                       <a:fillRect/>
                     </a:stretch>
@@ -656,7 +884,7 @@
                     </pic:cNvPicPr>
                   </pic:nvPicPr>
                   <pic:blipFill>
-                    <a:blip r:embed="rId10"/>
+                    <a:blip r:embed="rId13"/>
                     <a:stretch>
                       <a:fillRect/>
                     </a:stretch>
@@ -676,8 +904,6 @@
           </wp:inline>
         </w:drawing>
       </w:r>
-      <w:bookmarkStart w:id="0" w:name="_GoBack"/>
-      <w:bookmarkEnd w:id="0"/>
     </w:p>
     <w:sectPr>
       <w:pgSz w:w="11906" w:h="16838"/>

</xml_diff>